<commit_message>
v1.9: Expert panel 23-issue final resolution — DOI completion, sync all 4 manuscript variants, rebuild submission package
- Added DOIs to 5 previously missing references (Ondov/Mash, Ma/PatternHunter, Minh/IQ-TREE2, Price/FastTree2, Zielezinski 2017); Luo et al. 2019 marked [DOI not verified]
- Fixed V2_INFO_MATCHED.md: removed acknowledgement placeholder
- Synchronized all 4 manuscript files (REVISED, MAIN, IMMI_NAR_FORMAT, V2_INFO_MATCHED)
- Rebuilt all 3 manuscript DOCX + cover letter DOCX
- Rebuilt NAR_Submission_v1.4.zip (~5MB, 9 files)
- Verified: p=0.052 consistent, SwissTree 1.5×/d=1.32, COMPETING INTERESTS + AUTHOR CONTRIBUTIONS present in all files, no REVISION NOTES, no URL placeholders
</commit_message>
<xml_diff>
--- a/submission/Cover_Letter_NAR.docx
+++ b/submission/Cover_Letter_NAR.docx
@@ -174,13 +174,13 @@
           <w:b/>
           <w:bCs/>
         </w:rPr>
-        <w:t xml:space="preserve">K-mer cosine distance matches MSA+ML without alignment.</w:t>
-      </w:r>
-      <w:r>
-        <w:t xml:space="preserve"> </w:t>
-      </w:r>
-      <w:r>
-        <w:t xml:space="preserve">On n=200 indel-rich data (130 seeds), Fusang L0-1 (k-mer→cosine→NJ) achieves nRF=0.080±0.016 versus FastTree2 (MAFFT+GTR+CAT) nRF=0.085±0.025 — not significantly different (Wilcoxon p=0.052). Remarkably, IQ-TREE2 (MAFFT+GTR, fixed model) achieves nRF=0.147±0.027 — 1.8× worse (p&lt;0.001) — demonstrating that gold-standard ML degrades under indels even with a fixed substitution model, while k-mer cosine distance remains robust.</w:t>
+        <w:t xml:space="preserve">K-mer cosine distance is competitive with MSA+ML under indels.</w:t>
+      </w:r>
+      <w:r>
+        <w:t xml:space="preserve"> </w:t>
+      </w:r>
+      <w:r>
+        <w:t xml:space="preserve">On n=200 indel-rich data (112 seeds after outlier exclusion), Fusang L0-1 (k-mer→cosine→NJ) achieves nRF=0.080±0.016 versus FastTree2 (MAFFT+GTR+CAT) nRF=0.085±0.025 — a directional advantage at borderline significance (Wilcoxon p=0.052). IQ-TREE2 (MAFFT+GTR, fixed model) achieves nRF=0.147±0.027 — 1.8× worse (p&lt;0.001) — demonstrating that gold-standard ML degrades under indels even with a fixed substitution model, while k-mer cosine distance remains robust.</w:t>
       </w:r>
     </w:p>
     <w:p>
@@ -237,13 +237,13 @@
           <w:b/>
           <w:bCs/>
         </w:rPr>
-        <w:t xml:space="preserve">MinHash comparison: spaced k-mer cosine is 1.35× more robust than MinHash Jaccard under indels.</w:t>
-      </w:r>
-      <w:r>
-        <w:t xml:space="preserve"> </w:t>
-      </w:r>
-      <w:r>
-        <w:t xml:space="preserve">Mash (MinHash) achieves near-random nRF=1.005 on indel-rich data, while IMMI achieves nRF=0.742 (30 seeds vs TRUE tree), confirming that spaced k-mer cosine distance is inherently more tolerant of sequence length variation.</w:t>
+        <w:t xml:space="preserve">MinHash comparison: k-mer cosine is 1.35× more robust than MinHash Jaccard under indels.</w:t>
+      </w:r>
+      <w:r>
+        <w:t xml:space="preserve"> </w:t>
+      </w:r>
+      <w:r>
+        <w:t xml:space="preserve">Mash (MinHash) achieves near-random nRF=1.005 on indel-rich data (preliminary single-seed observation), while the k-mer cosine approach achieves nRF=0.742 (30 seeds vs TRUE tree), confirming that k-mer frequency vector cosine distance is more tolerant of sequence length variation.</w:t>
       </w:r>
     </w:p>
     <w:p>
@@ -285,7 +285,7 @@
         <w:t xml:space="preserve"> </w:t>
       </w:r>
       <w:r>
-        <w:t xml:space="preserve">A random forest classifier determines when L0-1 suffices versus when MSA+ML (Level 3) refinement is needed, achieving 100% accuracy on 88 simulated scenarios (88/88 correct, Wilson CI [0.958, 1.000]). Multi-k NJ (L0-1 ensemble) approaches MSA+ML (L3) accuracy — nRF=0.583 vs 0.592 (n=5, NS) — suggesting that k-mer ensemble methods may approach the accuracy of gold-standard methods even without alignment.</w:t>
+        <w:t xml:space="preserve">A random forest classifier determines when L0-1 suffices versus when MSA+ML (Level 3) refinement is needed, achieving 100% accuracy on 88 simulated scenarios (88/88 correct, Wilson CI [0.958, 1.000]; 5-fold CV ROC-AUC=0.84 on training data). Preliminary multi-k NJ (L0-1 ensemble) results show encouraging numerical agreement with MSA+ML (L3) — nRF=0.583 vs 0.592 (n=5, limited by MAFFT Windows instability; full Linux validation pending) — suggesting that k-mer ensemble methods warrant further investigation as alternatives to alignment-dependent approaches.</w:t>
       </w:r>
     </w:p>
     <w:p>
@@ -718,7 +718,7 @@
         <w:pStyle w:val="FirstParagraph"/>
       </w:pPr>
       <w:r>
-        <w:t xml:space="preserve">We believe our manuscript presents a significant methodological advance — establishing k-mer frequency vector cosine distance as a robust, scalable phylogenetic signal that rivals MSA+ML accuracy under indel-rich conditions. The multi-level IMMI architecture provides a principled framework for matching information resolution to computational need, with a learned boundary classifier that automates the decision between distance-based and alignment-based inference.</w:t>
+        <w:t xml:space="preserve">We believe our manuscript presents a significant methodological contribution — a systematic evaluation of k-mer frequency vector cosine distance as a robust, scalable phylogenetic signal for indel-rich conditions. The multi-level framework provides a principled architecture for matching information resolution to computational need, with a learned boundary classifier that automates the decision between distance-based and alignment-based inference.</w:t>
       </w:r>
     </w:p>
     <w:p>

</xml_diff>